<commit_message>
vault backup: 2026-05-11 23:34:28
</commit_message>
<xml_diff>
--- a/Учеба 4 семестр/Английский язык/Сокращенные монологи/Monologue_Operating_Systems.docx
+++ b/Учеба 4 семестр/Английский язык/Сокращенные монологи/Monologue_Operating_Systems.docx
@@ -180,25 +180,7 @@
         <w:rPr>
           <w:lang w:val="en-US"/>
         </w:rPr>
-        <w:t xml:space="preserve">1. An operating system is a type of software on the hard drive and enables the communicate and </w:t>
-      </w:r>
-      <w:r>
-        <w:rPr>
-          <w:lang w:val="en-US"/>
-        </w:rPr>
-        <w:t>operate hardware</w:t>
-      </w:r>
-      <w:r>
-        <w:rPr>
-          <w:lang w:val="en-US"/>
-        </w:rPr>
-        <w:t xml:space="preserve"> with </w:t>
-      </w:r>
-      <w:r>
-        <w:rPr>
-          <w:lang w:val="en-US"/>
-        </w:rPr>
-        <w:t>the software.</w:t>
+        <w:t>1. An operating system is a type of software on the hard drive and enables the communicate and operate hardware with the software.</w:t>
       </w:r>
     </w:p>
     <w:p>
@@ -659,15 +641,7 @@
           <w:iCs/>
           <w:color w:val="555555"/>
         </w:rPr>
-        <w:t>Наконец</w:t>
-      </w:r>
-      <w:r>
-        <w:rPr>
-          <w:i/>
-          <w:iCs/>
-          <w:color w:val="555555"/>
-        </w:rPr>
-        <w:t>, многопроцессорная операционная система способна поддерживать и использовать более одного процессора.</w:t>
+        <w:t>Наконец, многопроцессорная операционная система способна поддерживать и использовать более одного процессора.</w:t>
       </w:r>
     </w:p>
     <w:p>
@@ -832,7 +806,19 @@
         <w:rPr>
           <w:lang w:val="en-US"/>
         </w:rPr>
-        <w:t>2. First, it allocates resources such as processor time and memory so that programs can run efficiently.</w:t>
+        <w:t xml:space="preserve">2. First, it allocates resources </w:t>
+      </w:r>
+      <w:r>
+        <w:rPr>
+          <w:lang w:val="en-US"/>
+        </w:rPr>
+        <w:t xml:space="preserve">like </w:t>
+      </w:r>
+      <w:r>
+        <w:rPr>
+          <w:lang w:val="en-US"/>
+        </w:rPr>
+        <w:t>processor time and memory so that programs can run efficiently.</w:t>
       </w:r>
     </w:p>
     <w:p>
@@ -927,7 +913,19 @@
         <w:rPr>
           <w:lang w:val="en-US"/>
         </w:rPr>
-        <w:t>1. In the early days, programmers had to enter a program on rows of mechanical switches.</w:t>
+        <w:t>1. In</w:t>
+      </w:r>
+      <w:r>
+        <w:rPr>
+          <w:lang w:val="en-US"/>
+        </w:rPr>
+        <w:t xml:space="preserve"> the last</w:t>
+      </w:r>
+      <w:r>
+        <w:rPr>
+          <w:lang w:val="en-US"/>
+        </w:rPr>
+        <w:t>, programmers had to enter a program on rows of mechanical switches.</w:t>
       </w:r>
     </w:p>
     <w:p>
@@ -1199,7 +1197,19 @@
         <w:rPr>
           <w:lang w:val="en-US"/>
         </w:rPr>
-        <w:t>3. Advertising should focus on security and personalization.</w:t>
+        <w:t>3. Advertising should focus on securit</w:t>
+      </w:r>
+      <w:r>
+        <w:rPr>
+          <w:lang w:val="en-US"/>
+        </w:rPr>
+        <w:t>y</w:t>
+      </w:r>
+      <w:r>
+        <w:rPr>
+          <w:lang w:val="en-US"/>
+        </w:rPr>
+        <w:t>.</w:t>
       </w:r>
     </w:p>
     <w:p>
@@ -1226,7 +1236,7 @@
         <w:rPr>
           <w:lang w:val="en-US"/>
         </w:rPr>
-        <w:t>4. Most users care about their data, so this would attract more people.</w:t>
+        <w:t>4. Most users care about their data.</w:t>
       </w:r>
     </w:p>
     <w:p>
@@ -1239,7 +1249,15 @@
           <w:iCs/>
           <w:color w:val="555555"/>
         </w:rPr>
-        <w:t>Большинство пользователей заботятся о своих данных, поэтому это привлечёт больше людей.</w:t>
+        <w:t>Большинство пользователей заботятся о своих данных</w:t>
+      </w:r>
+      <w:r>
+        <w:rPr>
+          <w:i/>
+          <w:iCs/>
+          <w:color w:val="555555"/>
+        </w:rPr>
+        <w:t>.</w:t>
       </w:r>
     </w:p>
     <w:p>

</xml_diff>